<commit_message>
documentamos git clone y git pull a nuestro word
</commit_message>
<xml_diff>
--- a/GIT Y GITHUB.docx
+++ b/GIT Y GITHUB.docx
@@ -63,7 +63,6 @@
         </w:rPr>
         <w:t xml:space="preserve">GitHub es un software en la nube que tiene </w:t>
       </w:r>
-      <w:proofErr w:type="spellStart"/>
       <w:r>
         <w:rPr>
           <w:rFonts w:ascii="Arial" w:hAnsi="Arial" w:cs="Arial"/>
@@ -71,9 +70,8 @@
           <w:szCs w:val="24"/>
           <w:lang w:val="es-MX"/>
         </w:rPr>
-        <w:t>multiples</w:t>
-      </w:r>
-      <w:proofErr w:type="spellEnd"/>
+        <w:t>múltiples</w:t>
+      </w:r>
       <w:r>
         <w:rPr>
           <w:rFonts w:ascii="Arial" w:hAnsi="Arial" w:cs="Arial"/>
@@ -1327,250 +1325,16 @@
           <w:sz w:val="24"/>
           <w:szCs w:val="24"/>
         </w:rPr>
-        <w:t xml:space="preserve">Tu rama local queda “siguiendo” la rama remota. Gracias a ese </w:t>
-      </w:r>
-      <w:r>
-        <w:rPr>
-          <w:rFonts w:ascii="Arial" w:hAnsi="Arial" w:cs="Arial"/>
-          <w:sz w:val="24"/>
-          <w:szCs w:val="24"/>
-        </w:rPr>
-        <w:t>vínculo</w:t>
-      </w:r>
-      <w:r>
-        <w:rPr>
-          <w:rFonts w:ascii="Arial" w:hAnsi="Arial" w:cs="Arial"/>
-          <w:sz w:val="24"/>
-          <w:szCs w:val="24"/>
-        </w:rPr>
-        <w:t xml:space="preserve">, después de la primera vez Git sabe tres cosas automáticamente: a donde enviar cuando haces git </w:t>
-      </w:r>
-      <w:proofErr w:type="spellStart"/>
-      <w:r>
-        <w:rPr>
-          <w:rFonts w:ascii="Arial" w:hAnsi="Arial" w:cs="Arial"/>
-          <w:sz w:val="24"/>
-          <w:szCs w:val="24"/>
-        </w:rPr>
-        <w:t>push</w:t>
-      </w:r>
-      <w:proofErr w:type="spellEnd"/>
-      <w:r>
-        <w:rPr>
-          <w:rFonts w:ascii="Arial" w:hAnsi="Arial" w:cs="Arial"/>
-          <w:sz w:val="24"/>
-          <w:szCs w:val="24"/>
-        </w:rPr>
-        <w:t xml:space="preserve">, de donde traer cuando haces git </w:t>
-      </w:r>
-      <w:proofErr w:type="spellStart"/>
-      <w:r>
-        <w:rPr>
-          <w:rFonts w:ascii="Arial" w:hAnsi="Arial" w:cs="Arial"/>
-          <w:sz w:val="24"/>
-          <w:szCs w:val="24"/>
-        </w:rPr>
-        <w:t>pull</w:t>
-      </w:r>
-      <w:proofErr w:type="spellEnd"/>
-      <w:r>
-        <w:rPr>
-          <w:rFonts w:ascii="Arial" w:hAnsi="Arial" w:cs="Arial"/>
-          <w:sz w:val="24"/>
-          <w:szCs w:val="24"/>
-        </w:rPr>
-        <w:t xml:space="preserve"> y que tan adelantado o atrasado estas respecto a GitHub.</w:t>
-      </w:r>
-    </w:p>
-    <w:p>
-      <w:pPr>
-        <w:rPr>
-          <w:rFonts w:ascii="Arial" w:hAnsi="Arial" w:cs="Arial"/>
-          <w:sz w:val="24"/>
-          <w:szCs w:val="24"/>
-        </w:rPr>
-      </w:pPr>
-      <w:r>
-        <w:rPr>
-          <w:rFonts w:ascii="Arial" w:hAnsi="Arial" w:cs="Arial"/>
-          <w:sz w:val="24"/>
-          <w:szCs w:val="24"/>
-        </w:rPr>
-        <w:t>E</w:t>
-      </w:r>
-      <w:r>
-        <w:rPr>
-          <w:rFonts w:ascii="Arial" w:hAnsi="Arial" w:cs="Arial"/>
-          <w:sz w:val="24"/>
-          <w:szCs w:val="24"/>
-        </w:rPr>
-        <w:t xml:space="preserve">ntonces si deseo enviar un archivo a mi repositorio </w:t>
-      </w:r>
-      <w:proofErr w:type="spellStart"/>
-      <w:r>
-        <w:rPr>
-          <w:rFonts w:ascii="Arial" w:hAnsi="Arial" w:cs="Arial"/>
-          <w:sz w:val="24"/>
-          <w:szCs w:val="24"/>
-        </w:rPr>
-        <w:t>origin</w:t>
-      </w:r>
-      <w:proofErr w:type="spellEnd"/>
-      <w:r>
-        <w:rPr>
-          <w:rFonts w:ascii="Arial" w:hAnsi="Arial" w:cs="Arial"/>
-          <w:sz w:val="24"/>
-          <w:szCs w:val="24"/>
-        </w:rPr>
-        <w:t xml:space="preserve"> de </w:t>
-      </w:r>
-      <w:proofErr w:type="gramStart"/>
-      <w:r>
-        <w:rPr>
-          <w:rFonts w:ascii="Arial" w:hAnsi="Arial" w:cs="Arial"/>
-          <w:sz w:val="24"/>
-          <w:szCs w:val="24"/>
-        </w:rPr>
-        <w:t>G</w:t>
-      </w:r>
-      <w:r>
-        <w:rPr>
-          <w:rFonts w:ascii="Arial" w:hAnsi="Arial" w:cs="Arial"/>
-          <w:sz w:val="24"/>
-          <w:szCs w:val="24"/>
-        </w:rPr>
-        <w:t>itHub</w:t>
-      </w:r>
-      <w:proofErr w:type="gramEnd"/>
-      <w:r>
-        <w:rPr>
-          <w:rFonts w:ascii="Arial" w:hAnsi="Arial" w:cs="Arial"/>
-          <w:sz w:val="24"/>
-          <w:szCs w:val="24"/>
-        </w:rPr>
-        <w:t xml:space="preserve"> pero a una rama distinta, tendría que volver a escribir el comando completo</w:t>
-      </w:r>
-      <w:r>
-        <w:rPr>
-          <w:rFonts w:ascii="Arial" w:hAnsi="Arial" w:cs="Arial"/>
-          <w:sz w:val="24"/>
-          <w:szCs w:val="24"/>
-        </w:rPr>
-        <w:t xml:space="preserve"> git </w:t>
-      </w:r>
-      <w:proofErr w:type="spellStart"/>
-      <w:r>
-        <w:rPr>
-          <w:rFonts w:ascii="Arial" w:hAnsi="Arial" w:cs="Arial"/>
-          <w:sz w:val="24"/>
-          <w:szCs w:val="24"/>
-        </w:rPr>
-        <w:t>push</w:t>
-      </w:r>
-      <w:proofErr w:type="spellEnd"/>
-      <w:r>
-        <w:rPr>
-          <w:rFonts w:ascii="Arial" w:hAnsi="Arial" w:cs="Arial"/>
-          <w:sz w:val="24"/>
-          <w:szCs w:val="24"/>
-        </w:rPr>
-        <w:t xml:space="preserve"> -u </w:t>
-      </w:r>
-      <w:proofErr w:type="spellStart"/>
-      <w:r>
-        <w:rPr>
-          <w:rFonts w:ascii="Arial" w:hAnsi="Arial" w:cs="Arial"/>
-          <w:sz w:val="24"/>
-          <w:szCs w:val="24"/>
-        </w:rPr>
-        <w:t>origin</w:t>
-      </w:r>
-      <w:proofErr w:type="spellEnd"/>
-      <w:r>
-        <w:rPr>
-          <w:rFonts w:ascii="Arial" w:hAnsi="Arial" w:cs="Arial"/>
-          <w:sz w:val="24"/>
-          <w:szCs w:val="24"/>
-        </w:rPr>
-        <w:t xml:space="preserve"> nombre-de-la-rama. </w:t>
-      </w:r>
-      <w:r>
-        <w:rPr>
-          <w:rFonts w:ascii="Arial" w:hAnsi="Arial" w:cs="Arial"/>
-          <w:sz w:val="24"/>
-          <w:szCs w:val="24"/>
-        </w:rPr>
-        <w:t xml:space="preserve">Después de eso, cada vez que estés parado en esa rama y hagas git </w:t>
-      </w:r>
-      <w:proofErr w:type="spellStart"/>
-      <w:r>
-        <w:rPr>
-          <w:rFonts w:ascii="Arial" w:hAnsi="Arial" w:cs="Arial"/>
-          <w:sz w:val="24"/>
-          <w:szCs w:val="24"/>
-        </w:rPr>
-        <w:t>push</w:t>
-      </w:r>
-      <w:proofErr w:type="spellEnd"/>
-      <w:r>
-        <w:rPr>
-          <w:rFonts w:ascii="Arial" w:hAnsi="Arial" w:cs="Arial"/>
-          <w:sz w:val="24"/>
-          <w:szCs w:val="24"/>
-        </w:rPr>
-        <w:t>, Git ya sabe a cuál rama remota enviar los cambios.</w:t>
-      </w:r>
-      <w:r>
-        <w:rPr>
-          <w:rFonts w:ascii="Arial" w:hAnsi="Arial" w:cs="Arial"/>
-          <w:sz w:val="24"/>
-          <w:szCs w:val="24"/>
-        </w:rPr>
-        <w:t xml:space="preserve"> Veremos </w:t>
-      </w:r>
-      <w:r>
-        <w:rPr>
-          <w:rFonts w:ascii="Arial" w:hAnsi="Arial" w:cs="Arial"/>
-          <w:sz w:val="24"/>
-          <w:szCs w:val="24"/>
-        </w:rPr>
-        <w:t>más</w:t>
-      </w:r>
-      <w:r>
-        <w:rPr>
-          <w:rFonts w:ascii="Arial" w:hAnsi="Arial" w:cs="Arial"/>
-          <w:sz w:val="24"/>
-          <w:szCs w:val="24"/>
-        </w:rPr>
-        <w:t xml:space="preserve"> adelante como ubicarse en una rama en la git </w:t>
-      </w:r>
-      <w:proofErr w:type="spellStart"/>
-      <w:r>
-        <w:rPr>
-          <w:rFonts w:ascii="Arial" w:hAnsi="Arial" w:cs="Arial"/>
-          <w:sz w:val="24"/>
-          <w:szCs w:val="24"/>
-        </w:rPr>
-        <w:t>bash</w:t>
-      </w:r>
-      <w:proofErr w:type="spellEnd"/>
-      <w:r>
-        <w:rPr>
-          <w:rFonts w:ascii="Arial" w:hAnsi="Arial" w:cs="Arial"/>
-          <w:sz w:val="24"/>
-          <w:szCs w:val="24"/>
-        </w:rPr>
-        <w:t>.</w:t>
-      </w:r>
-    </w:p>
-    <w:p>
-      <w:pPr>
-        <w:rPr>
-          <w:rFonts w:ascii="Arial" w:hAnsi="Arial" w:cs="Arial"/>
-          <w:sz w:val="24"/>
-          <w:szCs w:val="24"/>
-        </w:rPr>
-      </w:pPr>
+        <w:t>Tu rama local queda “siguiendo” la rama remota</w:t>
+      </w:r>
+      <w:r>
+        <w:rPr>
+          <w:rFonts w:ascii="Arial" w:hAnsi="Arial" w:cs="Arial"/>
+          <w:sz w:val="24"/>
+          <w:szCs w:val="24"/>
+        </w:rPr>
+        <w:t xml:space="preserve"> </w:t>
+      </w:r>
       <w:r>
         <w:rPr>
           <w:rFonts w:ascii="Arial" w:hAnsi="Arial" w:cs="Arial"/>
@@ -1579,6 +1343,545 @@
           <w:sz w:val="24"/>
           <w:szCs w:val="24"/>
         </w:rPr>
+        <w:t>y crea la rama remota</w:t>
+      </w:r>
+      <w:r>
+        <w:rPr>
+          <w:rFonts w:ascii="Arial" w:hAnsi="Arial" w:cs="Arial"/>
+          <w:b/>
+          <w:bCs/>
+          <w:sz w:val="24"/>
+          <w:szCs w:val="24"/>
+        </w:rPr>
+        <w:t xml:space="preserve"> en GitHub</w:t>
+      </w:r>
+      <w:r>
+        <w:rPr>
+          <w:rFonts w:ascii="Arial" w:hAnsi="Arial" w:cs="Arial"/>
+          <w:sz w:val="24"/>
+          <w:szCs w:val="24"/>
+        </w:rPr>
+        <w:t xml:space="preserve">. Gracias a ese </w:t>
+      </w:r>
+      <w:r>
+        <w:rPr>
+          <w:rFonts w:ascii="Arial" w:hAnsi="Arial" w:cs="Arial"/>
+          <w:sz w:val="24"/>
+          <w:szCs w:val="24"/>
+        </w:rPr>
+        <w:t>vínculo</w:t>
+      </w:r>
+      <w:r>
+        <w:rPr>
+          <w:rFonts w:ascii="Arial" w:hAnsi="Arial" w:cs="Arial"/>
+          <w:sz w:val="24"/>
+          <w:szCs w:val="24"/>
+        </w:rPr>
+        <w:t xml:space="preserve">, después de la primera vez Git sabe tres cosas automáticamente: a donde enviar cuando haces git </w:t>
+      </w:r>
+      <w:proofErr w:type="spellStart"/>
+      <w:r>
+        <w:rPr>
+          <w:rFonts w:ascii="Arial" w:hAnsi="Arial" w:cs="Arial"/>
+          <w:sz w:val="24"/>
+          <w:szCs w:val="24"/>
+        </w:rPr>
+        <w:t>push</w:t>
+      </w:r>
+      <w:proofErr w:type="spellEnd"/>
+      <w:r>
+        <w:rPr>
+          <w:rFonts w:ascii="Arial" w:hAnsi="Arial" w:cs="Arial"/>
+          <w:sz w:val="24"/>
+          <w:szCs w:val="24"/>
+        </w:rPr>
+        <w:t xml:space="preserve">, de donde traer cuando haces git </w:t>
+      </w:r>
+      <w:proofErr w:type="spellStart"/>
+      <w:r>
+        <w:rPr>
+          <w:rFonts w:ascii="Arial" w:hAnsi="Arial" w:cs="Arial"/>
+          <w:sz w:val="24"/>
+          <w:szCs w:val="24"/>
+        </w:rPr>
+        <w:t>pull</w:t>
+      </w:r>
+      <w:proofErr w:type="spellEnd"/>
+      <w:r>
+        <w:rPr>
+          <w:rFonts w:ascii="Arial" w:hAnsi="Arial" w:cs="Arial"/>
+          <w:sz w:val="24"/>
+          <w:szCs w:val="24"/>
+        </w:rPr>
+        <w:t xml:space="preserve"> y que tan adelantado o atrasado estas respecto a GitHub.</w:t>
+      </w:r>
+    </w:p>
+    <w:p>
+      <w:pPr>
+        <w:rPr>
+          <w:rFonts w:ascii="Arial" w:hAnsi="Arial" w:cs="Arial"/>
+          <w:sz w:val="24"/>
+          <w:szCs w:val="24"/>
+        </w:rPr>
+      </w:pPr>
+      <w:r>
+        <w:rPr>
+          <w:rFonts w:ascii="Arial" w:hAnsi="Arial" w:cs="Arial"/>
+          <w:sz w:val="24"/>
+          <w:szCs w:val="24"/>
+        </w:rPr>
+        <w:t>E</w:t>
+      </w:r>
+      <w:r>
+        <w:rPr>
+          <w:rFonts w:ascii="Arial" w:hAnsi="Arial" w:cs="Arial"/>
+          <w:sz w:val="24"/>
+          <w:szCs w:val="24"/>
+        </w:rPr>
+        <w:t xml:space="preserve">ntonces si deseo enviar un archivo a mi repositorio </w:t>
+      </w:r>
+      <w:proofErr w:type="spellStart"/>
+      <w:r>
+        <w:rPr>
+          <w:rFonts w:ascii="Arial" w:hAnsi="Arial" w:cs="Arial"/>
+          <w:sz w:val="24"/>
+          <w:szCs w:val="24"/>
+        </w:rPr>
+        <w:t>origin</w:t>
+      </w:r>
+      <w:proofErr w:type="spellEnd"/>
+      <w:r>
+        <w:rPr>
+          <w:rFonts w:ascii="Arial" w:hAnsi="Arial" w:cs="Arial"/>
+          <w:sz w:val="24"/>
+          <w:szCs w:val="24"/>
+        </w:rPr>
+        <w:t xml:space="preserve"> de </w:t>
+      </w:r>
+      <w:proofErr w:type="gramStart"/>
+      <w:r>
+        <w:rPr>
+          <w:rFonts w:ascii="Arial" w:hAnsi="Arial" w:cs="Arial"/>
+          <w:sz w:val="24"/>
+          <w:szCs w:val="24"/>
+        </w:rPr>
+        <w:t>G</w:t>
+      </w:r>
+      <w:r>
+        <w:rPr>
+          <w:rFonts w:ascii="Arial" w:hAnsi="Arial" w:cs="Arial"/>
+          <w:sz w:val="24"/>
+          <w:szCs w:val="24"/>
+        </w:rPr>
+        <w:t>itHub</w:t>
+      </w:r>
+      <w:proofErr w:type="gramEnd"/>
+      <w:r>
+        <w:rPr>
+          <w:rFonts w:ascii="Arial" w:hAnsi="Arial" w:cs="Arial"/>
+          <w:sz w:val="24"/>
+          <w:szCs w:val="24"/>
+        </w:rPr>
+        <w:t xml:space="preserve"> pero a una rama distinta, tendría que volver a escribir el comando completo</w:t>
+      </w:r>
+      <w:r>
+        <w:rPr>
+          <w:rFonts w:ascii="Arial" w:hAnsi="Arial" w:cs="Arial"/>
+          <w:sz w:val="24"/>
+          <w:szCs w:val="24"/>
+        </w:rPr>
+        <w:t xml:space="preserve"> git </w:t>
+      </w:r>
+      <w:proofErr w:type="spellStart"/>
+      <w:r>
+        <w:rPr>
+          <w:rFonts w:ascii="Arial" w:hAnsi="Arial" w:cs="Arial"/>
+          <w:sz w:val="24"/>
+          <w:szCs w:val="24"/>
+        </w:rPr>
+        <w:t>push</w:t>
+      </w:r>
+      <w:proofErr w:type="spellEnd"/>
+      <w:r>
+        <w:rPr>
+          <w:rFonts w:ascii="Arial" w:hAnsi="Arial" w:cs="Arial"/>
+          <w:sz w:val="24"/>
+          <w:szCs w:val="24"/>
+        </w:rPr>
+        <w:t xml:space="preserve"> -u </w:t>
+      </w:r>
+      <w:proofErr w:type="spellStart"/>
+      <w:r>
+        <w:rPr>
+          <w:rFonts w:ascii="Arial" w:hAnsi="Arial" w:cs="Arial"/>
+          <w:sz w:val="24"/>
+          <w:szCs w:val="24"/>
+        </w:rPr>
+        <w:t>origin</w:t>
+      </w:r>
+      <w:proofErr w:type="spellEnd"/>
+      <w:r>
+        <w:rPr>
+          <w:rFonts w:ascii="Arial" w:hAnsi="Arial" w:cs="Arial"/>
+          <w:sz w:val="24"/>
+          <w:szCs w:val="24"/>
+        </w:rPr>
+        <w:t xml:space="preserve"> nombre-de-la-rama. </w:t>
+      </w:r>
+      <w:r>
+        <w:rPr>
+          <w:rFonts w:ascii="Arial" w:hAnsi="Arial" w:cs="Arial"/>
+          <w:sz w:val="24"/>
+          <w:szCs w:val="24"/>
+        </w:rPr>
+        <w:t xml:space="preserve">Después de eso, cada vez que estés parado en esa rama y hagas git </w:t>
+      </w:r>
+      <w:proofErr w:type="spellStart"/>
+      <w:r>
+        <w:rPr>
+          <w:rFonts w:ascii="Arial" w:hAnsi="Arial" w:cs="Arial"/>
+          <w:sz w:val="24"/>
+          <w:szCs w:val="24"/>
+        </w:rPr>
+        <w:t>push</w:t>
+      </w:r>
+      <w:proofErr w:type="spellEnd"/>
+      <w:r>
+        <w:rPr>
+          <w:rFonts w:ascii="Arial" w:hAnsi="Arial" w:cs="Arial"/>
+          <w:sz w:val="24"/>
+          <w:szCs w:val="24"/>
+        </w:rPr>
+        <w:t>, Git ya sabe a cuál rama remota enviar los cambios.</w:t>
+      </w:r>
+      <w:r>
+        <w:rPr>
+          <w:rFonts w:ascii="Arial" w:hAnsi="Arial" w:cs="Arial"/>
+          <w:sz w:val="24"/>
+          <w:szCs w:val="24"/>
+        </w:rPr>
+        <w:t xml:space="preserve"> Veremos </w:t>
+      </w:r>
+      <w:r>
+        <w:rPr>
+          <w:rFonts w:ascii="Arial" w:hAnsi="Arial" w:cs="Arial"/>
+          <w:sz w:val="24"/>
+          <w:szCs w:val="24"/>
+        </w:rPr>
+        <w:t>más</w:t>
+      </w:r>
+      <w:r>
+        <w:rPr>
+          <w:rFonts w:ascii="Arial" w:hAnsi="Arial" w:cs="Arial"/>
+          <w:sz w:val="24"/>
+          <w:szCs w:val="24"/>
+        </w:rPr>
+        <w:t xml:space="preserve"> adelante como ubicarse en una rama en la git </w:t>
+      </w:r>
+      <w:proofErr w:type="spellStart"/>
+      <w:r>
+        <w:rPr>
+          <w:rFonts w:ascii="Arial" w:hAnsi="Arial" w:cs="Arial"/>
+          <w:sz w:val="24"/>
+          <w:szCs w:val="24"/>
+        </w:rPr>
+        <w:t>bash</w:t>
+      </w:r>
+      <w:proofErr w:type="spellEnd"/>
+      <w:r>
+        <w:rPr>
+          <w:rFonts w:ascii="Arial" w:hAnsi="Arial" w:cs="Arial"/>
+          <w:sz w:val="24"/>
+          <w:szCs w:val="24"/>
+        </w:rPr>
+        <w:t>.</w:t>
+      </w:r>
+    </w:p>
+    <w:p>
+      <w:pPr>
+        <w:rPr>
+          <w:rFonts w:ascii="Arial" w:hAnsi="Arial" w:cs="Arial"/>
+          <w:sz w:val="24"/>
+          <w:szCs w:val="24"/>
+        </w:rPr>
+      </w:pPr>
+      <w:r>
+        <w:rPr>
+          <w:rFonts w:ascii="Arial" w:hAnsi="Arial" w:cs="Arial"/>
+          <w:sz w:val="24"/>
+          <w:szCs w:val="24"/>
+        </w:rPr>
+        <w:t>Ahora imaginemos que tenemos archivos en nuestro repositorio en la nube de GitHub que queremos traerlos a nuestro repositorio local en Git.</w:t>
+      </w:r>
+      <w:r>
+        <w:rPr>
+          <w:rFonts w:ascii="Arial" w:hAnsi="Arial" w:cs="Arial"/>
+          <w:sz w:val="24"/>
+          <w:szCs w:val="24"/>
+        </w:rPr>
+        <w:t xml:space="preserve"> Para ello nos ayudamos de los comandos git clone y git </w:t>
+      </w:r>
+      <w:proofErr w:type="spellStart"/>
+      <w:r>
+        <w:rPr>
+          <w:rFonts w:ascii="Arial" w:hAnsi="Arial" w:cs="Arial"/>
+          <w:sz w:val="24"/>
+          <w:szCs w:val="24"/>
+        </w:rPr>
+        <w:t>pull</w:t>
+      </w:r>
+      <w:proofErr w:type="spellEnd"/>
+      <w:r>
+        <w:rPr>
+          <w:rFonts w:ascii="Arial" w:hAnsi="Arial" w:cs="Arial"/>
+          <w:sz w:val="24"/>
+          <w:szCs w:val="24"/>
+        </w:rPr>
+        <w:t>:</w:t>
+      </w:r>
+    </w:p>
+    <w:p>
+      <w:pPr>
+        <w:rPr>
+          <w:rFonts w:ascii="Arial" w:hAnsi="Arial" w:cs="Arial"/>
+          <w:sz w:val="24"/>
+          <w:szCs w:val="24"/>
+        </w:rPr>
+      </w:pPr>
+      <w:r>
+        <w:rPr>
+          <w:rFonts w:ascii="Arial" w:hAnsi="Arial" w:cs="Arial"/>
+          <w:sz w:val="24"/>
+          <w:szCs w:val="24"/>
+        </w:rPr>
+        <w:t>git clone:</w:t>
+      </w:r>
+      <w:r>
+        <w:rPr>
+          <w:rFonts w:ascii="Arial" w:hAnsi="Arial" w:cs="Arial"/>
+          <w:sz w:val="24"/>
+          <w:szCs w:val="24"/>
+        </w:rPr>
+        <w:t xml:space="preserve"> Lo usas una sola vez</w:t>
+      </w:r>
+      <w:r>
+        <w:rPr>
+          <w:rFonts w:ascii="Arial" w:hAnsi="Arial" w:cs="Arial"/>
+          <w:sz w:val="24"/>
+          <w:szCs w:val="24"/>
+        </w:rPr>
+        <w:t xml:space="preserve"> cuando aun no tienes el repositorio en tu computadora.</w:t>
+      </w:r>
+    </w:p>
+    <w:p>
+      <w:pPr>
+        <w:rPr>
+          <w:rFonts w:ascii="Arial" w:hAnsi="Arial" w:cs="Arial"/>
+          <w:sz w:val="24"/>
+          <w:szCs w:val="24"/>
+        </w:rPr>
+      </w:pPr>
+      <w:r>
+        <w:rPr>
+          <w:rFonts w:ascii="Arial" w:hAnsi="Arial" w:cs="Arial"/>
+          <w:sz w:val="24"/>
+          <w:szCs w:val="24"/>
+        </w:rPr>
+        <w:t>Este comando d</w:t>
+      </w:r>
+      <w:r>
+        <w:rPr>
+          <w:rFonts w:ascii="Arial" w:hAnsi="Arial" w:cs="Arial"/>
+          <w:sz w:val="24"/>
+          <w:szCs w:val="24"/>
+        </w:rPr>
+        <w:t xml:space="preserve">escarga todo el repositorio desde GitHub </w:t>
+      </w:r>
+      <w:r>
+        <w:rPr>
+          <w:rFonts w:ascii="Arial" w:hAnsi="Arial" w:cs="Arial"/>
+          <w:sz w:val="24"/>
+          <w:szCs w:val="24"/>
+        </w:rPr>
+        <w:t xml:space="preserve">y crea la carpeta en tu maquina con todo adentro: archivos, </w:t>
+      </w:r>
+      <w:r>
+        <w:rPr>
+          <w:rFonts w:ascii="Arial" w:hAnsi="Arial" w:cs="Arial"/>
+          <w:sz w:val="24"/>
+          <w:szCs w:val="24"/>
+        </w:rPr>
+        <w:t xml:space="preserve">historial de </w:t>
+      </w:r>
+      <w:proofErr w:type="spellStart"/>
+      <w:r>
+        <w:rPr>
+          <w:rFonts w:ascii="Arial" w:hAnsi="Arial" w:cs="Arial"/>
+          <w:sz w:val="24"/>
+          <w:szCs w:val="24"/>
+        </w:rPr>
+        <w:t>commits</w:t>
+      </w:r>
+      <w:proofErr w:type="spellEnd"/>
+      <w:r>
+        <w:rPr>
+          <w:rFonts w:ascii="Arial" w:hAnsi="Arial" w:cs="Arial"/>
+          <w:sz w:val="24"/>
+          <w:szCs w:val="24"/>
+        </w:rPr>
+        <w:t>, todo.</w:t>
+      </w:r>
+      <w:r>
+        <w:rPr>
+          <w:rFonts w:ascii="Arial" w:hAnsi="Arial" w:cs="Arial"/>
+          <w:sz w:val="24"/>
+          <w:szCs w:val="24"/>
+        </w:rPr>
+        <w:t xml:space="preserve"> </w:t>
+      </w:r>
+      <w:r>
+        <w:rPr>
+          <w:rFonts w:ascii="Arial" w:hAnsi="Arial" w:cs="Arial"/>
+          <w:sz w:val="24"/>
+          <w:szCs w:val="24"/>
+        </w:rPr>
+        <w:t>Su sintaxis es:</w:t>
+      </w:r>
+    </w:p>
+    <w:p>
+      <w:pPr>
+        <w:rPr>
+          <w:rFonts w:ascii="Arial" w:hAnsi="Arial" w:cs="Arial"/>
+          <w:sz w:val="24"/>
+          <w:szCs w:val="24"/>
+          <w:lang w:val="en-US"/>
+        </w:rPr>
+      </w:pPr>
+      <w:r>
+        <w:rPr>
+          <w:rFonts w:ascii="Arial" w:hAnsi="Arial" w:cs="Arial"/>
+          <w:sz w:val="24"/>
+          <w:szCs w:val="24"/>
+          <w:lang w:val="en-US"/>
+        </w:rPr>
+        <w:t xml:space="preserve">git clone </w:t>
+      </w:r>
+      <w:hyperlink r:id="rId7" w:history="1">
+        <w:r>
+          <w:rPr>
+            <w:rStyle w:val="Hipervnculo"/>
+            <w:rFonts w:ascii="Arial" w:hAnsi="Arial" w:cs="Arial"/>
+            <w:color w:val="auto"/>
+            <w:sz w:val="24"/>
+            <w:szCs w:val="24"/>
+            <w:lang w:val="en-US"/>
+          </w:rPr>
+          <w:t>https://github.com/MarioWindranger/mokepon.git</w:t>
+        </w:r>
+      </w:hyperlink>
+    </w:p>
+    <w:p>
+      <w:pPr>
+        <w:rPr>
+          <w:rFonts w:ascii="Arial" w:hAnsi="Arial" w:cs="Arial"/>
+          <w:sz w:val="24"/>
+          <w:szCs w:val="24"/>
+        </w:rPr>
+      </w:pPr>
+      <w:r>
+        <w:rPr>
+          <w:rFonts w:ascii="Arial" w:hAnsi="Arial" w:cs="Arial"/>
+          <w:sz w:val="24"/>
+          <w:szCs w:val="24"/>
+        </w:rPr>
+        <w:t xml:space="preserve">git </w:t>
+      </w:r>
+      <w:proofErr w:type="spellStart"/>
+      <w:r>
+        <w:rPr>
+          <w:rFonts w:ascii="Arial" w:hAnsi="Arial" w:cs="Arial"/>
+          <w:sz w:val="24"/>
+          <w:szCs w:val="24"/>
+        </w:rPr>
+        <w:t>pull</w:t>
+      </w:r>
+      <w:proofErr w:type="spellEnd"/>
+      <w:r>
+        <w:rPr>
+          <w:rFonts w:ascii="Arial" w:hAnsi="Arial" w:cs="Arial"/>
+          <w:sz w:val="24"/>
+          <w:szCs w:val="24"/>
+        </w:rPr>
+        <w:t xml:space="preserve">: </w:t>
+      </w:r>
+      <w:r>
+        <w:rPr>
+          <w:rFonts w:ascii="Arial" w:hAnsi="Arial" w:cs="Arial"/>
+          <w:sz w:val="24"/>
+          <w:szCs w:val="24"/>
+        </w:rPr>
+        <w:t>Lo usas c</w:t>
+      </w:r>
+      <w:r>
+        <w:rPr>
+          <w:rFonts w:ascii="Arial" w:hAnsi="Arial" w:cs="Arial"/>
+          <w:sz w:val="24"/>
+          <w:szCs w:val="24"/>
+        </w:rPr>
+        <w:t>uando ya tienes el repositorio en tu computadora y quieres traer los cambios nuevos existentes en GitHub</w:t>
+      </w:r>
+      <w:r>
+        <w:rPr>
+          <w:rFonts w:ascii="Arial" w:hAnsi="Arial" w:cs="Arial"/>
+          <w:sz w:val="24"/>
+          <w:szCs w:val="24"/>
+        </w:rPr>
+        <w:t>. Su sintaxis es:</w:t>
+      </w:r>
+    </w:p>
+    <w:p>
+      <w:pPr>
+        <w:rPr>
+          <w:rFonts w:ascii="Arial" w:hAnsi="Arial" w:cs="Arial"/>
+          <w:sz w:val="24"/>
+          <w:szCs w:val="24"/>
+        </w:rPr>
+      </w:pPr>
+      <w:r>
+        <w:rPr>
+          <w:rFonts w:ascii="Arial" w:hAnsi="Arial" w:cs="Arial"/>
+          <w:sz w:val="24"/>
+          <w:szCs w:val="24"/>
+        </w:rPr>
+        <w:t xml:space="preserve">git </w:t>
+      </w:r>
+      <w:proofErr w:type="spellStart"/>
+      <w:r>
+        <w:rPr>
+          <w:rFonts w:ascii="Arial" w:hAnsi="Arial" w:cs="Arial"/>
+          <w:sz w:val="24"/>
+          <w:szCs w:val="24"/>
+        </w:rPr>
+        <w:t>pull</w:t>
+      </w:r>
+      <w:proofErr w:type="spellEnd"/>
+    </w:p>
+    <w:p>
+      <w:pPr>
+        <w:rPr>
+          <w:rFonts w:ascii="Arial" w:hAnsi="Arial" w:cs="Arial"/>
+          <w:sz w:val="24"/>
+          <w:szCs w:val="24"/>
+        </w:rPr>
+      </w:pPr>
+      <w:r>
+        <w:rPr>
+          <w:rFonts w:ascii="Arial" w:hAnsi="Arial" w:cs="Arial"/>
+          <w:b/>
+          <w:bCs/>
+          <w:sz w:val="24"/>
+          <w:szCs w:val="24"/>
+        </w:rPr>
         <w:t>2.</w:t>
       </w:r>
       <w:r>
@@ -1735,6 +2038,7 @@
           <w:sz w:val="24"/>
           <w:szCs w:val="24"/>
         </w:rPr>
+        <w:lastRenderedPageBreak/>
         <w:drawing>
           <wp:inline distT="0" distB="0" distL="0" distR="0" wp14:anchorId="56A19F65" wp14:editId="1F2CBC48">
             <wp:extent cx="4486275" cy="2933700"/>
@@ -1751,7 +2055,7 @@
                     <pic:cNvPicPr/>
                   </pic:nvPicPr>
                   <pic:blipFill>
-                    <a:blip r:embed="rId7"/>
+                    <a:blip r:embed="rId8"/>
                     <a:stretch>
                       <a:fillRect/>
                     </a:stretch>
@@ -1786,7 +2090,6 @@
           <w:sz w:val="24"/>
           <w:szCs w:val="24"/>
         </w:rPr>
-        <w:lastRenderedPageBreak/>
         <w:t>Este comando tiene a su vez subcomandos:</w:t>
       </w:r>
     </w:p>
@@ -2572,6 +2875,7 @@
           <w:sz w:val="24"/>
           <w:szCs w:val="24"/>
         </w:rPr>
+        <w:lastRenderedPageBreak/>
         <w:t xml:space="preserve">Entonces la rama secundaria termina siendo una copia paralela de tu proyecto </w:t>
       </w:r>
       <w:r>
@@ -2737,255 +3041,17 @@
           <w:sz w:val="24"/>
           <w:szCs w:val="24"/>
         </w:rPr>
-        <w:t xml:space="preserve"> nombre-rama: Crea una nueva rama con su nombre.</w:t>
-      </w:r>
-    </w:p>
-    <w:p>
-      <w:pPr>
-        <w:rPr>
-          <w:rFonts w:ascii="Arial" w:hAnsi="Arial" w:cs="Arial"/>
-          <w:sz w:val="24"/>
-          <w:szCs w:val="24"/>
-        </w:rPr>
-      </w:pPr>
-      <w:r>
-        <w:rPr>
-          <w:rFonts w:ascii="Arial" w:hAnsi="Arial" w:cs="Arial"/>
-          <w:sz w:val="24"/>
-          <w:szCs w:val="24"/>
-        </w:rPr>
-        <w:t xml:space="preserve">git </w:t>
-      </w:r>
-      <w:proofErr w:type="spellStart"/>
-      <w:r>
-        <w:rPr>
-          <w:rFonts w:ascii="Arial" w:hAnsi="Arial" w:cs="Arial"/>
-          <w:sz w:val="24"/>
-          <w:szCs w:val="24"/>
-        </w:rPr>
-        <w:t>checkout</w:t>
-      </w:r>
-      <w:proofErr w:type="spellEnd"/>
-      <w:r>
-        <w:rPr>
-          <w:rFonts w:ascii="Arial" w:hAnsi="Arial" w:cs="Arial"/>
-          <w:sz w:val="24"/>
-          <w:szCs w:val="24"/>
-        </w:rPr>
-        <w:t xml:space="preserve"> nombre-rama: Moverte a esa rama.</w:t>
-      </w:r>
-    </w:p>
-    <w:p>
-      <w:pPr>
-        <w:rPr>
-          <w:rFonts w:ascii="Arial" w:hAnsi="Arial" w:cs="Arial"/>
-          <w:sz w:val="24"/>
-          <w:szCs w:val="24"/>
-        </w:rPr>
-      </w:pPr>
-      <w:r>
-        <w:rPr>
-          <w:rFonts w:ascii="Arial" w:hAnsi="Arial" w:cs="Arial"/>
-          <w:sz w:val="24"/>
-          <w:szCs w:val="24"/>
-        </w:rPr>
-        <w:t xml:space="preserve">git </w:t>
-      </w:r>
-      <w:proofErr w:type="spellStart"/>
-      <w:r>
-        <w:rPr>
-          <w:rFonts w:ascii="Arial" w:hAnsi="Arial" w:cs="Arial"/>
-          <w:sz w:val="24"/>
-          <w:szCs w:val="24"/>
-        </w:rPr>
-        <w:t>checkout</w:t>
-      </w:r>
-      <w:proofErr w:type="spellEnd"/>
-      <w:r>
-        <w:rPr>
-          <w:rFonts w:ascii="Arial" w:hAnsi="Arial" w:cs="Arial"/>
-          <w:sz w:val="24"/>
-          <w:szCs w:val="24"/>
-        </w:rPr>
-        <w:t xml:space="preserve"> -b n</w:t>
-      </w:r>
-      <w:r>
-        <w:rPr>
-          <w:rFonts w:ascii="Arial" w:hAnsi="Arial" w:cs="Arial"/>
-          <w:sz w:val="24"/>
-          <w:szCs w:val="24"/>
-        </w:rPr>
-        <w:t>ombre-rama: Crear la rama y moverte a ella al mismo tiempo.</w:t>
-      </w:r>
-    </w:p>
-    <w:p>
-      <w:pPr>
-        <w:rPr>
-          <w:rFonts w:ascii="Arial" w:hAnsi="Arial" w:cs="Arial"/>
-          <w:sz w:val="24"/>
-          <w:szCs w:val="24"/>
-        </w:rPr>
-      </w:pPr>
-      <w:r>
-        <w:rPr>
-          <w:rFonts w:ascii="Arial" w:hAnsi="Arial" w:cs="Arial"/>
-          <w:sz w:val="24"/>
-          <w:szCs w:val="24"/>
-        </w:rPr>
-        <w:t xml:space="preserve">git </w:t>
-      </w:r>
-      <w:proofErr w:type="spellStart"/>
-      <w:r>
-        <w:rPr>
-          <w:rFonts w:ascii="Arial" w:hAnsi="Arial" w:cs="Arial"/>
-          <w:sz w:val="24"/>
-          <w:szCs w:val="24"/>
-        </w:rPr>
-        <w:t>branch</w:t>
-      </w:r>
-      <w:proofErr w:type="spellEnd"/>
-      <w:r>
-        <w:rPr>
-          <w:rFonts w:ascii="Arial" w:hAnsi="Arial" w:cs="Arial"/>
-          <w:sz w:val="24"/>
-          <w:szCs w:val="24"/>
-        </w:rPr>
-        <w:t>: Ver todas tus ramas.</w:t>
-      </w:r>
-    </w:p>
-    <w:p>
-      <w:pPr>
-        <w:rPr>
-          <w:rFonts w:ascii="Arial" w:hAnsi="Arial" w:cs="Arial"/>
-          <w:sz w:val="24"/>
-          <w:szCs w:val="24"/>
-        </w:rPr>
-      </w:pPr>
-      <w:r>
-        <w:rPr>
-          <w:rFonts w:ascii="Arial" w:hAnsi="Arial" w:cs="Arial"/>
-          <w:sz w:val="24"/>
-          <w:szCs w:val="24"/>
-        </w:rPr>
-        <w:lastRenderedPageBreak/>
-        <w:t xml:space="preserve">git </w:t>
-      </w:r>
-      <w:proofErr w:type="spellStart"/>
-      <w:r>
-        <w:rPr>
-          <w:rFonts w:ascii="Arial" w:hAnsi="Arial" w:cs="Arial"/>
-          <w:sz w:val="24"/>
-          <w:szCs w:val="24"/>
-        </w:rPr>
-        <w:t>branch</w:t>
-      </w:r>
-      <w:proofErr w:type="spellEnd"/>
-      <w:r>
-        <w:rPr>
-          <w:rFonts w:ascii="Arial" w:hAnsi="Arial" w:cs="Arial"/>
-          <w:sz w:val="24"/>
-          <w:szCs w:val="24"/>
-        </w:rPr>
-        <w:t xml:space="preserve"> -d nombre-rama: Eliminar rama que ya no necesitas</w:t>
-      </w:r>
-      <w:r>
-        <w:rPr>
-          <w:rFonts w:ascii="Arial" w:hAnsi="Arial" w:cs="Arial"/>
-          <w:sz w:val="24"/>
-          <w:szCs w:val="24"/>
-        </w:rPr>
-        <w:t>.</w:t>
-      </w:r>
-    </w:p>
-    <w:p>
-      <w:pPr>
-        <w:rPr>
-          <w:rFonts w:ascii="Arial" w:hAnsi="Arial" w:cs="Arial"/>
-          <w:sz w:val="24"/>
-          <w:szCs w:val="24"/>
-        </w:rPr>
-      </w:pPr>
-      <w:r>
-        <w:rPr>
-          <w:rFonts w:ascii="Arial" w:hAnsi="Arial" w:cs="Arial"/>
-          <w:sz w:val="24"/>
-          <w:szCs w:val="24"/>
-        </w:rPr>
-        <w:t>Si deseamos fusionar una rama con master:</w:t>
-      </w:r>
-    </w:p>
-    <w:p>
-      <w:pPr>
-        <w:rPr>
-          <w:rFonts w:ascii="Arial" w:hAnsi="Arial" w:cs="Arial"/>
-          <w:sz w:val="24"/>
-          <w:szCs w:val="24"/>
-        </w:rPr>
-      </w:pPr>
-      <w:r>
-        <w:rPr>
-          <w:rFonts w:ascii="Arial" w:hAnsi="Arial" w:cs="Arial"/>
-          <w:sz w:val="24"/>
-          <w:szCs w:val="24"/>
-        </w:rPr>
-        <w:t xml:space="preserve">git </w:t>
-      </w:r>
-      <w:proofErr w:type="spellStart"/>
-      <w:r>
-        <w:rPr>
-          <w:rFonts w:ascii="Arial" w:hAnsi="Arial" w:cs="Arial"/>
-          <w:sz w:val="24"/>
-          <w:szCs w:val="24"/>
-        </w:rPr>
-        <w:t>checkout</w:t>
-      </w:r>
-      <w:proofErr w:type="spellEnd"/>
-      <w:r>
-        <w:rPr>
-          <w:rFonts w:ascii="Arial" w:hAnsi="Arial" w:cs="Arial"/>
-          <w:sz w:val="24"/>
-          <w:szCs w:val="24"/>
-        </w:rPr>
-        <w:t xml:space="preserve"> master: Primero nos movemos a master</w:t>
-      </w:r>
-    </w:p>
-    <w:p>
-      <w:pPr>
-        <w:rPr>
-          <w:rFonts w:ascii="Arial" w:hAnsi="Arial" w:cs="Arial"/>
-          <w:sz w:val="24"/>
-          <w:szCs w:val="24"/>
-        </w:rPr>
-      </w:pPr>
-      <w:r>
-        <w:rPr>
-          <w:rFonts w:ascii="Arial" w:hAnsi="Arial" w:cs="Arial"/>
-          <w:sz w:val="24"/>
-          <w:szCs w:val="24"/>
-        </w:rPr>
-        <w:t xml:space="preserve">git </w:t>
-      </w:r>
-      <w:proofErr w:type="spellStart"/>
-      <w:r>
-        <w:rPr>
-          <w:rFonts w:ascii="Arial" w:hAnsi="Arial" w:cs="Arial"/>
-          <w:sz w:val="24"/>
-          <w:szCs w:val="24"/>
-        </w:rPr>
-        <w:t>merge</w:t>
-      </w:r>
-      <w:proofErr w:type="spellEnd"/>
-      <w:r>
-        <w:rPr>
-          <w:rFonts w:ascii="Arial" w:hAnsi="Arial" w:cs="Arial"/>
-          <w:sz w:val="24"/>
-          <w:szCs w:val="24"/>
-        </w:rPr>
-        <w:t xml:space="preserve"> nombre-rama: Se fusiona la rama secundaria con la rama principal.</w:t>
-      </w:r>
-    </w:p>
-    <w:p>
-      <w:pPr>
+        <w:t xml:space="preserve"> nombre-rama: Crea una nueva rama con su nombre</w:t>
+      </w:r>
+      <w:r>
+        <w:rPr>
+          <w:rFonts w:ascii="Arial" w:hAnsi="Arial" w:cs="Arial"/>
+          <w:sz w:val="24"/>
+          <w:szCs w:val="24"/>
+        </w:rPr>
+        <w:t xml:space="preserve"> en </w:t>
+      </w:r>
+      <w:r>
         <w:rPr>
           <w:rFonts w:ascii="Arial" w:hAnsi="Arial" w:cs="Arial"/>
           <w:b/>
@@ -2993,8 +3059,262 @@
           <w:sz w:val="24"/>
           <w:szCs w:val="24"/>
         </w:rPr>
-      </w:pPr>
-      <w:r>
+        <w:t>TU computadora</w:t>
+      </w:r>
+      <w:r>
+        <w:rPr>
+          <w:rFonts w:ascii="Arial" w:hAnsi="Arial" w:cs="Arial"/>
+          <w:sz w:val="24"/>
+          <w:szCs w:val="24"/>
+        </w:rPr>
+        <w:t>.</w:t>
+      </w:r>
+    </w:p>
+    <w:p>
+      <w:pPr>
+        <w:rPr>
+          <w:rFonts w:ascii="Arial" w:hAnsi="Arial" w:cs="Arial"/>
+          <w:sz w:val="24"/>
+          <w:szCs w:val="24"/>
+        </w:rPr>
+      </w:pPr>
+      <w:r>
+        <w:rPr>
+          <w:rFonts w:ascii="Arial" w:hAnsi="Arial" w:cs="Arial"/>
+          <w:sz w:val="24"/>
+          <w:szCs w:val="24"/>
+        </w:rPr>
+        <w:t xml:space="preserve">git </w:t>
+      </w:r>
+      <w:proofErr w:type="spellStart"/>
+      <w:r>
+        <w:rPr>
+          <w:rFonts w:ascii="Arial" w:hAnsi="Arial" w:cs="Arial"/>
+          <w:sz w:val="24"/>
+          <w:szCs w:val="24"/>
+        </w:rPr>
+        <w:t>checkout</w:t>
+      </w:r>
+      <w:proofErr w:type="spellEnd"/>
+      <w:r>
+        <w:rPr>
+          <w:rFonts w:ascii="Arial" w:hAnsi="Arial" w:cs="Arial"/>
+          <w:sz w:val="24"/>
+          <w:szCs w:val="24"/>
+        </w:rPr>
+        <w:t xml:space="preserve"> nombre-rama: Moverte a esa rama.</w:t>
+      </w:r>
+    </w:p>
+    <w:p>
+      <w:pPr>
+        <w:rPr>
+          <w:rFonts w:ascii="Arial" w:hAnsi="Arial" w:cs="Arial"/>
+          <w:sz w:val="24"/>
+          <w:szCs w:val="24"/>
+        </w:rPr>
+      </w:pPr>
+      <w:r>
+        <w:rPr>
+          <w:rFonts w:ascii="Arial" w:hAnsi="Arial" w:cs="Arial"/>
+          <w:sz w:val="24"/>
+          <w:szCs w:val="24"/>
+        </w:rPr>
+        <w:t xml:space="preserve">git </w:t>
+      </w:r>
+      <w:proofErr w:type="spellStart"/>
+      <w:r>
+        <w:rPr>
+          <w:rFonts w:ascii="Arial" w:hAnsi="Arial" w:cs="Arial"/>
+          <w:sz w:val="24"/>
+          <w:szCs w:val="24"/>
+        </w:rPr>
+        <w:t>checkout</w:t>
+      </w:r>
+      <w:proofErr w:type="spellEnd"/>
+      <w:r>
+        <w:rPr>
+          <w:rFonts w:ascii="Arial" w:hAnsi="Arial" w:cs="Arial"/>
+          <w:sz w:val="24"/>
+          <w:szCs w:val="24"/>
+        </w:rPr>
+        <w:t xml:space="preserve"> -b n</w:t>
+      </w:r>
+      <w:r>
+        <w:rPr>
+          <w:rFonts w:ascii="Arial" w:hAnsi="Arial" w:cs="Arial"/>
+          <w:sz w:val="24"/>
+          <w:szCs w:val="24"/>
+        </w:rPr>
+        <w:t>ombre-rama: Crear la rama y moverte a ella al mismo tiempo.</w:t>
+      </w:r>
+    </w:p>
+    <w:p>
+      <w:pPr>
+        <w:rPr>
+          <w:rFonts w:ascii="Arial" w:hAnsi="Arial" w:cs="Arial"/>
+          <w:sz w:val="24"/>
+          <w:szCs w:val="24"/>
+        </w:rPr>
+      </w:pPr>
+      <w:r>
+        <w:rPr>
+          <w:rFonts w:ascii="Arial" w:hAnsi="Arial" w:cs="Arial"/>
+          <w:sz w:val="24"/>
+          <w:szCs w:val="24"/>
+        </w:rPr>
+        <w:t xml:space="preserve">git </w:t>
+      </w:r>
+      <w:proofErr w:type="spellStart"/>
+      <w:r>
+        <w:rPr>
+          <w:rFonts w:ascii="Arial" w:hAnsi="Arial" w:cs="Arial"/>
+          <w:sz w:val="24"/>
+          <w:szCs w:val="24"/>
+        </w:rPr>
+        <w:t>branch</w:t>
+      </w:r>
+      <w:proofErr w:type="spellEnd"/>
+      <w:r>
+        <w:rPr>
+          <w:rFonts w:ascii="Arial" w:hAnsi="Arial" w:cs="Arial"/>
+          <w:sz w:val="24"/>
+          <w:szCs w:val="24"/>
+        </w:rPr>
+        <w:t>: Ver todas tus ramas.</w:t>
+      </w:r>
+    </w:p>
+    <w:p>
+      <w:pPr>
+        <w:rPr>
+          <w:rFonts w:ascii="Arial" w:hAnsi="Arial" w:cs="Arial"/>
+          <w:sz w:val="24"/>
+          <w:szCs w:val="24"/>
+        </w:rPr>
+      </w:pPr>
+      <w:r>
+        <w:rPr>
+          <w:rFonts w:ascii="Arial" w:hAnsi="Arial" w:cs="Arial"/>
+          <w:sz w:val="24"/>
+          <w:szCs w:val="24"/>
+        </w:rPr>
+        <w:t xml:space="preserve">git </w:t>
+      </w:r>
+      <w:proofErr w:type="spellStart"/>
+      <w:r>
+        <w:rPr>
+          <w:rFonts w:ascii="Arial" w:hAnsi="Arial" w:cs="Arial"/>
+          <w:sz w:val="24"/>
+          <w:szCs w:val="24"/>
+        </w:rPr>
+        <w:t>branch</w:t>
+      </w:r>
+      <w:proofErr w:type="spellEnd"/>
+      <w:r>
+        <w:rPr>
+          <w:rFonts w:ascii="Arial" w:hAnsi="Arial" w:cs="Arial"/>
+          <w:sz w:val="24"/>
+          <w:szCs w:val="24"/>
+        </w:rPr>
+        <w:t xml:space="preserve"> -d nombre-rama: Eliminar rama que ya no necesitas</w:t>
+      </w:r>
+      <w:r>
+        <w:rPr>
+          <w:rFonts w:ascii="Arial" w:hAnsi="Arial" w:cs="Arial"/>
+          <w:sz w:val="24"/>
+          <w:szCs w:val="24"/>
+        </w:rPr>
+        <w:t>.</w:t>
+      </w:r>
+    </w:p>
+    <w:p>
+      <w:pPr>
+        <w:rPr>
+          <w:rFonts w:ascii="Arial" w:hAnsi="Arial" w:cs="Arial"/>
+          <w:sz w:val="24"/>
+          <w:szCs w:val="24"/>
+        </w:rPr>
+      </w:pPr>
+      <w:r>
+        <w:rPr>
+          <w:rFonts w:ascii="Arial" w:hAnsi="Arial" w:cs="Arial"/>
+          <w:sz w:val="24"/>
+          <w:szCs w:val="24"/>
+        </w:rPr>
+        <w:t>Si deseamos fusionar una rama con master:</w:t>
+      </w:r>
+    </w:p>
+    <w:p>
+      <w:pPr>
+        <w:rPr>
+          <w:rFonts w:ascii="Arial" w:hAnsi="Arial" w:cs="Arial"/>
+          <w:sz w:val="24"/>
+          <w:szCs w:val="24"/>
+        </w:rPr>
+      </w:pPr>
+      <w:r>
+        <w:rPr>
+          <w:rFonts w:ascii="Arial" w:hAnsi="Arial" w:cs="Arial"/>
+          <w:sz w:val="24"/>
+          <w:szCs w:val="24"/>
+        </w:rPr>
+        <w:t xml:space="preserve">git </w:t>
+      </w:r>
+      <w:proofErr w:type="spellStart"/>
+      <w:r>
+        <w:rPr>
+          <w:rFonts w:ascii="Arial" w:hAnsi="Arial" w:cs="Arial"/>
+          <w:sz w:val="24"/>
+          <w:szCs w:val="24"/>
+        </w:rPr>
+        <w:t>checkout</w:t>
+      </w:r>
+      <w:proofErr w:type="spellEnd"/>
+      <w:r>
+        <w:rPr>
+          <w:rFonts w:ascii="Arial" w:hAnsi="Arial" w:cs="Arial"/>
+          <w:sz w:val="24"/>
+          <w:szCs w:val="24"/>
+        </w:rPr>
+        <w:t xml:space="preserve"> master: Primero nos movemos a master</w:t>
+      </w:r>
+    </w:p>
+    <w:p>
+      <w:pPr>
+        <w:rPr>
+          <w:rFonts w:ascii="Arial" w:hAnsi="Arial" w:cs="Arial"/>
+          <w:sz w:val="24"/>
+          <w:szCs w:val="24"/>
+        </w:rPr>
+      </w:pPr>
+      <w:r>
+        <w:rPr>
+          <w:rFonts w:ascii="Arial" w:hAnsi="Arial" w:cs="Arial"/>
+          <w:sz w:val="24"/>
+          <w:szCs w:val="24"/>
+        </w:rPr>
+        <w:t xml:space="preserve">git </w:t>
+      </w:r>
+      <w:proofErr w:type="spellStart"/>
+      <w:r>
+        <w:rPr>
+          <w:rFonts w:ascii="Arial" w:hAnsi="Arial" w:cs="Arial"/>
+          <w:sz w:val="24"/>
+          <w:szCs w:val="24"/>
+        </w:rPr>
+        <w:t>merge</w:t>
+      </w:r>
+      <w:proofErr w:type="spellEnd"/>
+      <w:r>
+        <w:rPr>
+          <w:rFonts w:ascii="Arial" w:hAnsi="Arial" w:cs="Arial"/>
+          <w:sz w:val="24"/>
+          <w:szCs w:val="24"/>
+        </w:rPr>
+        <w:t xml:space="preserve"> nombre-rama: Se fusiona la rama secundaria con la rama principal.</w:t>
+      </w:r>
+    </w:p>
+    <w:p>
+      <w:pPr>
         <w:rPr>
           <w:rFonts w:ascii="Arial" w:hAnsi="Arial" w:cs="Arial"/>
           <w:b/>
@@ -3002,9 +3322,7 @@
           <w:sz w:val="24"/>
           <w:szCs w:val="24"/>
         </w:rPr>
-        <w:t xml:space="preserve">Un ejemplo práctico con </w:t>
-      </w:r>
-      <w:proofErr w:type="spellStart"/>
+      </w:pPr>
       <w:r>
         <w:rPr>
           <w:rFonts w:ascii="Arial" w:hAnsi="Arial" w:cs="Arial"/>
@@ -3013,321 +3331,9 @@
           <w:sz w:val="24"/>
           <w:szCs w:val="24"/>
         </w:rPr>
-        <w:t>Mokepon</w:t>
-      </w:r>
-      <w:proofErr w:type="spellEnd"/>
-    </w:p>
-    <w:p>
-      <w:pPr>
-        <w:rPr>
-          <w:rFonts w:ascii="Arial" w:hAnsi="Arial" w:cs="Arial"/>
-          <w:sz w:val="24"/>
-          <w:szCs w:val="24"/>
-        </w:rPr>
-      </w:pPr>
-      <w:r>
-        <w:rPr>
-          <w:rFonts w:ascii="Arial" w:hAnsi="Arial" w:cs="Arial"/>
-          <w:sz w:val="24"/>
-          <w:szCs w:val="24"/>
-        </w:rPr>
-        <w:t xml:space="preserve">Imagina que quieres agregar una nueva criatura al </w:t>
-      </w:r>
-      <w:r>
-        <w:rPr>
-          <w:rFonts w:ascii="Arial" w:hAnsi="Arial" w:cs="Arial"/>
-          <w:sz w:val="24"/>
-          <w:szCs w:val="24"/>
-        </w:rPr>
-        <w:t>juego,</w:t>
-      </w:r>
-      <w:r>
-        <w:rPr>
-          <w:rFonts w:ascii="Arial" w:hAnsi="Arial" w:cs="Arial"/>
-          <w:sz w:val="24"/>
-          <w:szCs w:val="24"/>
-        </w:rPr>
-        <w:t xml:space="preserve"> pero no sabes si va a quedar bien:</w:t>
-      </w:r>
-    </w:p>
-    <w:p>
-      <w:pPr>
-        <w:rPr>
-          <w:rFonts w:ascii="Arial" w:hAnsi="Arial" w:cs="Arial"/>
-          <w:sz w:val="24"/>
-          <w:szCs w:val="24"/>
-        </w:rPr>
-      </w:pPr>
-      <w:r>
-        <w:rPr>
-          <w:rFonts w:ascii="Arial" w:hAnsi="Arial" w:cs="Arial"/>
-          <w:sz w:val="24"/>
-          <w:szCs w:val="24"/>
-        </w:rPr>
-        <w:t xml:space="preserve">git </w:t>
-      </w:r>
-      <w:proofErr w:type="spellStart"/>
-      <w:r>
-        <w:rPr>
-          <w:rFonts w:ascii="Arial" w:hAnsi="Arial" w:cs="Arial"/>
-          <w:sz w:val="24"/>
-          <w:szCs w:val="24"/>
-        </w:rPr>
-        <w:t>checkout</w:t>
-      </w:r>
-      <w:proofErr w:type="spellEnd"/>
-      <w:r>
-        <w:rPr>
-          <w:rFonts w:ascii="Arial" w:hAnsi="Arial" w:cs="Arial"/>
-          <w:sz w:val="24"/>
-          <w:szCs w:val="24"/>
-        </w:rPr>
-        <w:t xml:space="preserve"> -b nueva-criatura    </w:t>
-      </w:r>
-      <w:r>
-        <w:rPr>
-          <w:rFonts w:ascii="Arial" w:hAnsi="Arial" w:cs="Arial"/>
-          <w:sz w:val="24"/>
-          <w:szCs w:val="24"/>
-        </w:rPr>
-        <w:t>//</w:t>
-      </w:r>
-      <w:r>
-        <w:rPr>
-          <w:rFonts w:ascii="Arial" w:hAnsi="Arial" w:cs="Arial"/>
-          <w:sz w:val="24"/>
-          <w:szCs w:val="24"/>
-        </w:rPr>
-        <w:t xml:space="preserve"> creas la rama y te mueves a ella</w:t>
-      </w:r>
-    </w:p>
-    <w:p>
-      <w:pPr>
-        <w:rPr>
-          <w:rFonts w:ascii="Arial" w:hAnsi="Arial" w:cs="Arial"/>
-          <w:sz w:val="24"/>
-          <w:szCs w:val="24"/>
-          <w:lang w:val="en-US"/>
-        </w:rPr>
-      </w:pPr>
-      <w:r>
-        <w:rPr>
-          <w:rFonts w:ascii="Arial" w:hAnsi="Arial" w:cs="Arial"/>
-          <w:sz w:val="24"/>
-          <w:szCs w:val="24"/>
-          <w:lang w:val="en-US"/>
-        </w:rPr>
-        <w:t>//</w:t>
-      </w:r>
-      <w:r>
-        <w:rPr>
-          <w:rFonts w:ascii="Arial" w:hAnsi="Arial" w:cs="Arial"/>
-          <w:sz w:val="24"/>
-          <w:szCs w:val="24"/>
-          <w:lang w:val="en-US"/>
-        </w:rPr>
-        <w:t xml:space="preserve"> ... </w:t>
-      </w:r>
-      <w:proofErr w:type="spellStart"/>
-      <w:r>
-        <w:rPr>
-          <w:rFonts w:ascii="Arial" w:hAnsi="Arial" w:cs="Arial"/>
-          <w:sz w:val="24"/>
-          <w:szCs w:val="24"/>
-          <w:lang w:val="en-US"/>
-        </w:rPr>
-        <w:t>trabajas</w:t>
-      </w:r>
-      <w:proofErr w:type="spellEnd"/>
-      <w:r>
-        <w:rPr>
-          <w:rFonts w:ascii="Arial" w:hAnsi="Arial" w:cs="Arial"/>
-          <w:sz w:val="24"/>
-          <w:szCs w:val="24"/>
-          <w:lang w:val="en-US"/>
-        </w:rPr>
-        <w:t xml:space="preserve">, </w:t>
-      </w:r>
-      <w:proofErr w:type="spellStart"/>
-      <w:r>
-        <w:rPr>
-          <w:rFonts w:ascii="Arial" w:hAnsi="Arial" w:cs="Arial"/>
-          <w:sz w:val="24"/>
-          <w:szCs w:val="24"/>
-          <w:lang w:val="en-US"/>
-        </w:rPr>
-        <w:t>haces</w:t>
-      </w:r>
-      <w:proofErr w:type="spellEnd"/>
-      <w:r>
-        <w:rPr>
-          <w:rFonts w:ascii="Arial" w:hAnsi="Arial" w:cs="Arial"/>
-          <w:sz w:val="24"/>
-          <w:szCs w:val="24"/>
-          <w:lang w:val="en-US"/>
-        </w:rPr>
-        <w:t xml:space="preserve"> commits ...</w:t>
-      </w:r>
-    </w:p>
-    <w:p>
-      <w:pPr>
-        <w:rPr>
-          <w:rFonts w:ascii="Arial" w:hAnsi="Arial" w:cs="Arial"/>
-          <w:sz w:val="24"/>
-          <w:szCs w:val="24"/>
-          <w:lang w:val="en-US"/>
-        </w:rPr>
-      </w:pPr>
-      <w:r>
-        <w:rPr>
-          <w:rFonts w:ascii="Arial" w:hAnsi="Arial" w:cs="Arial"/>
-          <w:sz w:val="24"/>
-          <w:szCs w:val="24"/>
-          <w:lang w:val="en-US"/>
-        </w:rPr>
-        <w:t xml:space="preserve">git checkout master               </w:t>
-      </w:r>
-      <w:r>
-        <w:rPr>
-          <w:rFonts w:ascii="Arial" w:hAnsi="Arial" w:cs="Arial"/>
-          <w:sz w:val="24"/>
-          <w:szCs w:val="24"/>
-          <w:lang w:val="en-US"/>
-        </w:rPr>
-        <w:t>//</w:t>
-      </w:r>
-      <w:r>
-        <w:rPr>
-          <w:rFonts w:ascii="Arial" w:hAnsi="Arial" w:cs="Arial"/>
-          <w:sz w:val="24"/>
-          <w:szCs w:val="24"/>
-          <w:lang w:val="en-US"/>
-        </w:rPr>
-        <w:t xml:space="preserve"> </w:t>
-      </w:r>
-      <w:proofErr w:type="spellStart"/>
-      <w:r>
-        <w:rPr>
-          <w:rFonts w:ascii="Arial" w:hAnsi="Arial" w:cs="Arial"/>
-          <w:sz w:val="24"/>
-          <w:szCs w:val="24"/>
-          <w:lang w:val="en-US"/>
-        </w:rPr>
-        <w:t>vuelves</w:t>
-      </w:r>
-      <w:proofErr w:type="spellEnd"/>
-      <w:r>
-        <w:rPr>
-          <w:rFonts w:ascii="Arial" w:hAnsi="Arial" w:cs="Arial"/>
-          <w:sz w:val="24"/>
-          <w:szCs w:val="24"/>
-          <w:lang w:val="en-US"/>
-        </w:rPr>
-        <w:t xml:space="preserve"> a master</w:t>
-      </w:r>
-    </w:p>
-    <w:p>
-      <w:pPr>
-        <w:rPr>
-          <w:rFonts w:ascii="Arial" w:hAnsi="Arial" w:cs="Arial"/>
-          <w:sz w:val="24"/>
-          <w:szCs w:val="24"/>
-        </w:rPr>
-      </w:pPr>
-      <w:r>
-        <w:rPr>
-          <w:rFonts w:ascii="Arial" w:hAnsi="Arial" w:cs="Arial"/>
-          <w:sz w:val="24"/>
-          <w:szCs w:val="24"/>
-        </w:rPr>
-        <w:t xml:space="preserve">git </w:t>
-      </w:r>
-      <w:proofErr w:type="spellStart"/>
-      <w:r>
-        <w:rPr>
-          <w:rFonts w:ascii="Arial" w:hAnsi="Arial" w:cs="Arial"/>
-          <w:sz w:val="24"/>
-          <w:szCs w:val="24"/>
-        </w:rPr>
-        <w:t>merge</w:t>
-      </w:r>
-      <w:proofErr w:type="spellEnd"/>
-      <w:r>
-        <w:rPr>
-          <w:rFonts w:ascii="Arial" w:hAnsi="Arial" w:cs="Arial"/>
-          <w:sz w:val="24"/>
-          <w:szCs w:val="24"/>
-        </w:rPr>
-        <w:t xml:space="preserve"> nueva-criatura          </w:t>
-      </w:r>
-      <w:r>
-        <w:rPr>
-          <w:rFonts w:ascii="Arial" w:hAnsi="Arial" w:cs="Arial"/>
-          <w:sz w:val="24"/>
-          <w:szCs w:val="24"/>
-        </w:rPr>
-        <w:t>//</w:t>
-      </w:r>
-      <w:r>
-        <w:rPr>
-          <w:rFonts w:ascii="Arial" w:hAnsi="Arial" w:cs="Arial"/>
-          <w:sz w:val="24"/>
-          <w:szCs w:val="24"/>
-        </w:rPr>
-        <w:t xml:space="preserve"> fusionas cuando está listo</w:t>
-      </w:r>
-    </w:p>
-    <w:p>
-      <w:pPr>
-        <w:rPr>
-          <w:rFonts w:ascii="Arial" w:hAnsi="Arial" w:cs="Arial"/>
-          <w:sz w:val="24"/>
-          <w:szCs w:val="24"/>
-        </w:rPr>
-      </w:pPr>
-      <w:r>
-        <w:rPr>
-          <w:rFonts w:ascii="Arial" w:hAnsi="Arial" w:cs="Arial"/>
-          <w:sz w:val="24"/>
-          <w:szCs w:val="24"/>
-        </w:rPr>
-        <w:t>Si la criatura no quedó bien, simplemente borras la rama y master queda intacto como si nada hubiera pasado.</w:t>
-      </w:r>
-    </w:p>
-    <w:p>
-      <w:pPr>
-        <w:rPr>
-          <w:rFonts w:ascii="Arial" w:hAnsi="Arial" w:cs="Arial"/>
-          <w:sz w:val="24"/>
-          <w:szCs w:val="24"/>
-        </w:rPr>
-      </w:pPr>
-      <w:r>
-        <w:rPr>
-          <w:rFonts w:ascii="Arial" w:hAnsi="Arial" w:cs="Arial"/>
-          <w:sz w:val="24"/>
-          <w:szCs w:val="24"/>
-        </w:rPr>
-        <w:t>Las ramas son la razón por la que los equipos de desarrollo pueden trabajar varias personas al mismo tiempo en el mismo proyecto sin pisarse el trabajo entre sí. Cada quien trabaja en su propia rama y al final todo se fusiona.</w:t>
-      </w:r>
-    </w:p>
-    <w:p>
-      <w:pPr>
-        <w:rPr>
-          <w:rFonts w:ascii="Arial" w:hAnsi="Arial" w:cs="Arial"/>
-          <w:sz w:val="24"/>
-          <w:szCs w:val="24"/>
-        </w:rPr>
-      </w:pPr>
-    </w:p>
-    <w:p>
-      <w:pPr>
-        <w:rPr>
-          <w:rFonts w:ascii="Arial" w:hAnsi="Arial" w:cs="Arial"/>
-          <w:sz w:val="24"/>
-          <w:szCs w:val="24"/>
-        </w:rPr>
-      </w:pPr>
+        <w:t xml:space="preserve">Un ejemplo práctico con </w:t>
+      </w:r>
+      <w:proofErr w:type="spellStart"/>
       <w:r>
         <w:rPr>
           <w:rFonts w:ascii="Arial" w:hAnsi="Arial" w:cs="Arial"/>
@@ -3336,8 +3342,321 @@
           <w:sz w:val="24"/>
           <w:szCs w:val="24"/>
         </w:rPr>
-        <w:t>4.</w:t>
-      </w:r>
+        <w:t>Mokepon</w:t>
+      </w:r>
+      <w:proofErr w:type="spellEnd"/>
+    </w:p>
+    <w:p>
+      <w:pPr>
+        <w:rPr>
+          <w:rFonts w:ascii="Arial" w:hAnsi="Arial" w:cs="Arial"/>
+          <w:sz w:val="24"/>
+          <w:szCs w:val="24"/>
+        </w:rPr>
+      </w:pPr>
+      <w:r>
+        <w:rPr>
+          <w:rFonts w:ascii="Arial" w:hAnsi="Arial" w:cs="Arial"/>
+          <w:sz w:val="24"/>
+          <w:szCs w:val="24"/>
+        </w:rPr>
+        <w:t xml:space="preserve">Imagina que quieres agregar una nueva criatura al </w:t>
+      </w:r>
+      <w:r>
+        <w:rPr>
+          <w:rFonts w:ascii="Arial" w:hAnsi="Arial" w:cs="Arial"/>
+          <w:sz w:val="24"/>
+          <w:szCs w:val="24"/>
+        </w:rPr>
+        <w:t>juego,</w:t>
+      </w:r>
+      <w:r>
+        <w:rPr>
+          <w:rFonts w:ascii="Arial" w:hAnsi="Arial" w:cs="Arial"/>
+          <w:sz w:val="24"/>
+          <w:szCs w:val="24"/>
+        </w:rPr>
+        <w:t xml:space="preserve"> pero no sabes si va a quedar bien:</w:t>
+      </w:r>
+    </w:p>
+    <w:p>
+      <w:pPr>
+        <w:rPr>
+          <w:rFonts w:ascii="Arial" w:hAnsi="Arial" w:cs="Arial"/>
+          <w:sz w:val="24"/>
+          <w:szCs w:val="24"/>
+        </w:rPr>
+      </w:pPr>
+      <w:r>
+        <w:rPr>
+          <w:rFonts w:ascii="Arial" w:hAnsi="Arial" w:cs="Arial"/>
+          <w:sz w:val="24"/>
+          <w:szCs w:val="24"/>
+        </w:rPr>
+        <w:t xml:space="preserve">git </w:t>
+      </w:r>
+      <w:proofErr w:type="spellStart"/>
+      <w:r>
+        <w:rPr>
+          <w:rFonts w:ascii="Arial" w:hAnsi="Arial" w:cs="Arial"/>
+          <w:sz w:val="24"/>
+          <w:szCs w:val="24"/>
+        </w:rPr>
+        <w:t>checkout</w:t>
+      </w:r>
+      <w:proofErr w:type="spellEnd"/>
+      <w:r>
+        <w:rPr>
+          <w:rFonts w:ascii="Arial" w:hAnsi="Arial" w:cs="Arial"/>
+          <w:sz w:val="24"/>
+          <w:szCs w:val="24"/>
+        </w:rPr>
+        <w:t xml:space="preserve"> -b nueva-criatura    </w:t>
+      </w:r>
+      <w:r>
+        <w:rPr>
+          <w:rFonts w:ascii="Arial" w:hAnsi="Arial" w:cs="Arial"/>
+          <w:sz w:val="24"/>
+          <w:szCs w:val="24"/>
+        </w:rPr>
+        <w:t>//</w:t>
+      </w:r>
+      <w:r>
+        <w:rPr>
+          <w:rFonts w:ascii="Arial" w:hAnsi="Arial" w:cs="Arial"/>
+          <w:sz w:val="24"/>
+          <w:szCs w:val="24"/>
+        </w:rPr>
+        <w:t xml:space="preserve"> creas la rama y te mueves a ella</w:t>
+      </w:r>
+    </w:p>
+    <w:p>
+      <w:pPr>
+        <w:rPr>
+          <w:rFonts w:ascii="Arial" w:hAnsi="Arial" w:cs="Arial"/>
+          <w:sz w:val="24"/>
+          <w:szCs w:val="24"/>
+          <w:lang w:val="en-US"/>
+        </w:rPr>
+      </w:pPr>
+      <w:r>
+        <w:rPr>
+          <w:rFonts w:ascii="Arial" w:hAnsi="Arial" w:cs="Arial"/>
+          <w:sz w:val="24"/>
+          <w:szCs w:val="24"/>
+          <w:lang w:val="en-US"/>
+        </w:rPr>
+        <w:t>//</w:t>
+      </w:r>
+      <w:r>
+        <w:rPr>
+          <w:rFonts w:ascii="Arial" w:hAnsi="Arial" w:cs="Arial"/>
+          <w:sz w:val="24"/>
+          <w:szCs w:val="24"/>
+          <w:lang w:val="en-US"/>
+        </w:rPr>
+        <w:t xml:space="preserve"> ... </w:t>
+      </w:r>
+      <w:proofErr w:type="spellStart"/>
+      <w:r>
+        <w:rPr>
+          <w:rFonts w:ascii="Arial" w:hAnsi="Arial" w:cs="Arial"/>
+          <w:sz w:val="24"/>
+          <w:szCs w:val="24"/>
+          <w:lang w:val="en-US"/>
+        </w:rPr>
+        <w:t>trabajas</w:t>
+      </w:r>
+      <w:proofErr w:type="spellEnd"/>
+      <w:r>
+        <w:rPr>
+          <w:rFonts w:ascii="Arial" w:hAnsi="Arial" w:cs="Arial"/>
+          <w:sz w:val="24"/>
+          <w:szCs w:val="24"/>
+          <w:lang w:val="en-US"/>
+        </w:rPr>
+        <w:t xml:space="preserve">, </w:t>
+      </w:r>
+      <w:proofErr w:type="spellStart"/>
+      <w:r>
+        <w:rPr>
+          <w:rFonts w:ascii="Arial" w:hAnsi="Arial" w:cs="Arial"/>
+          <w:sz w:val="24"/>
+          <w:szCs w:val="24"/>
+          <w:lang w:val="en-US"/>
+        </w:rPr>
+        <w:t>haces</w:t>
+      </w:r>
+      <w:proofErr w:type="spellEnd"/>
+      <w:r>
+        <w:rPr>
+          <w:rFonts w:ascii="Arial" w:hAnsi="Arial" w:cs="Arial"/>
+          <w:sz w:val="24"/>
+          <w:szCs w:val="24"/>
+          <w:lang w:val="en-US"/>
+        </w:rPr>
+        <w:t xml:space="preserve"> commits ...</w:t>
+      </w:r>
+    </w:p>
+    <w:p>
+      <w:pPr>
+        <w:rPr>
+          <w:rFonts w:ascii="Arial" w:hAnsi="Arial" w:cs="Arial"/>
+          <w:sz w:val="24"/>
+          <w:szCs w:val="24"/>
+          <w:lang w:val="en-US"/>
+        </w:rPr>
+      </w:pPr>
+      <w:r>
+        <w:rPr>
+          <w:rFonts w:ascii="Arial" w:hAnsi="Arial" w:cs="Arial"/>
+          <w:sz w:val="24"/>
+          <w:szCs w:val="24"/>
+          <w:lang w:val="en-US"/>
+        </w:rPr>
+        <w:t xml:space="preserve">git checkout master               </w:t>
+      </w:r>
+      <w:r>
+        <w:rPr>
+          <w:rFonts w:ascii="Arial" w:hAnsi="Arial" w:cs="Arial"/>
+          <w:sz w:val="24"/>
+          <w:szCs w:val="24"/>
+          <w:lang w:val="en-US"/>
+        </w:rPr>
+        <w:t>//</w:t>
+      </w:r>
+      <w:r>
+        <w:rPr>
+          <w:rFonts w:ascii="Arial" w:hAnsi="Arial" w:cs="Arial"/>
+          <w:sz w:val="24"/>
+          <w:szCs w:val="24"/>
+          <w:lang w:val="en-US"/>
+        </w:rPr>
+        <w:t xml:space="preserve"> </w:t>
+      </w:r>
+      <w:proofErr w:type="spellStart"/>
+      <w:r>
+        <w:rPr>
+          <w:rFonts w:ascii="Arial" w:hAnsi="Arial" w:cs="Arial"/>
+          <w:sz w:val="24"/>
+          <w:szCs w:val="24"/>
+          <w:lang w:val="en-US"/>
+        </w:rPr>
+        <w:t>vuelves</w:t>
+      </w:r>
+      <w:proofErr w:type="spellEnd"/>
+      <w:r>
+        <w:rPr>
+          <w:rFonts w:ascii="Arial" w:hAnsi="Arial" w:cs="Arial"/>
+          <w:sz w:val="24"/>
+          <w:szCs w:val="24"/>
+          <w:lang w:val="en-US"/>
+        </w:rPr>
+        <w:t xml:space="preserve"> a master</w:t>
+      </w:r>
+    </w:p>
+    <w:p>
+      <w:pPr>
+        <w:rPr>
+          <w:rFonts w:ascii="Arial" w:hAnsi="Arial" w:cs="Arial"/>
+          <w:sz w:val="24"/>
+          <w:szCs w:val="24"/>
+        </w:rPr>
+      </w:pPr>
+      <w:r>
+        <w:rPr>
+          <w:rFonts w:ascii="Arial" w:hAnsi="Arial" w:cs="Arial"/>
+          <w:sz w:val="24"/>
+          <w:szCs w:val="24"/>
+        </w:rPr>
+        <w:t xml:space="preserve">git </w:t>
+      </w:r>
+      <w:proofErr w:type="spellStart"/>
+      <w:r>
+        <w:rPr>
+          <w:rFonts w:ascii="Arial" w:hAnsi="Arial" w:cs="Arial"/>
+          <w:sz w:val="24"/>
+          <w:szCs w:val="24"/>
+        </w:rPr>
+        <w:t>merge</w:t>
+      </w:r>
+      <w:proofErr w:type="spellEnd"/>
+      <w:r>
+        <w:rPr>
+          <w:rFonts w:ascii="Arial" w:hAnsi="Arial" w:cs="Arial"/>
+          <w:sz w:val="24"/>
+          <w:szCs w:val="24"/>
+        </w:rPr>
+        <w:t xml:space="preserve"> nueva-criatura          </w:t>
+      </w:r>
+      <w:r>
+        <w:rPr>
+          <w:rFonts w:ascii="Arial" w:hAnsi="Arial" w:cs="Arial"/>
+          <w:sz w:val="24"/>
+          <w:szCs w:val="24"/>
+        </w:rPr>
+        <w:t>//</w:t>
+      </w:r>
+      <w:r>
+        <w:rPr>
+          <w:rFonts w:ascii="Arial" w:hAnsi="Arial" w:cs="Arial"/>
+          <w:sz w:val="24"/>
+          <w:szCs w:val="24"/>
+        </w:rPr>
+        <w:t xml:space="preserve"> fusionas cuando está listo</w:t>
+      </w:r>
+    </w:p>
+    <w:p>
+      <w:pPr>
+        <w:rPr>
+          <w:rFonts w:ascii="Arial" w:hAnsi="Arial" w:cs="Arial"/>
+          <w:sz w:val="24"/>
+          <w:szCs w:val="24"/>
+        </w:rPr>
+      </w:pPr>
+      <w:r>
+        <w:rPr>
+          <w:rFonts w:ascii="Arial" w:hAnsi="Arial" w:cs="Arial"/>
+          <w:sz w:val="24"/>
+          <w:szCs w:val="24"/>
+        </w:rPr>
+        <w:t>Si la criatura no quedó bien, simplemente borras la rama y master queda intacto como si nada hubiera pasado.</w:t>
+      </w:r>
+    </w:p>
+    <w:p>
+      <w:pPr>
+        <w:rPr>
+          <w:rFonts w:ascii="Arial" w:hAnsi="Arial" w:cs="Arial"/>
+          <w:sz w:val="24"/>
+          <w:szCs w:val="24"/>
+        </w:rPr>
+      </w:pPr>
+      <w:r>
+        <w:rPr>
+          <w:rFonts w:ascii="Arial" w:hAnsi="Arial" w:cs="Arial"/>
+          <w:sz w:val="24"/>
+          <w:szCs w:val="24"/>
+        </w:rPr>
+        <w:t>Las ramas son la razón por la que los equipos de desarrollo pueden trabajar varias personas al mismo tiempo en el mismo proyecto sin pisarse el trabajo entre sí. Cada quien trabaja en su propia rama y al final todo se fusiona.</w:t>
+      </w:r>
+    </w:p>
+    <w:p>
+      <w:pPr>
+        <w:rPr>
+          <w:rFonts w:ascii="Arial" w:hAnsi="Arial" w:cs="Arial"/>
+          <w:sz w:val="24"/>
+          <w:szCs w:val="24"/>
+        </w:rPr>
+      </w:pPr>
+    </w:p>
+    <w:p>
+      <w:pPr>
+        <w:rPr>
+          <w:rFonts w:ascii="Arial" w:hAnsi="Arial" w:cs="Arial"/>
+          <w:sz w:val="24"/>
+          <w:szCs w:val="24"/>
+        </w:rPr>
+      </w:pPr>
       <w:r>
         <w:rPr>
           <w:rFonts w:ascii="Arial" w:hAnsi="Arial" w:cs="Arial"/>
@@ -3346,15 +3665,7 @@
           <w:sz w:val="24"/>
           <w:szCs w:val="24"/>
         </w:rPr>
-        <w:t xml:space="preserve"> </w:t>
-      </w:r>
-      <w:r>
-        <w:rPr>
-          <w:rFonts w:ascii="Arial" w:hAnsi="Arial" w:cs="Arial"/>
-          <w:sz w:val="24"/>
-          <w:szCs w:val="24"/>
-        </w:rPr>
-        <w:t>Si algo sale mal en git</w:t>
+        <w:t>4.</w:t>
       </w:r>
       <w:r>
         <w:rPr>
@@ -3372,7 +3683,7 @@
           <w:sz w:val="24"/>
           <w:szCs w:val="24"/>
         </w:rPr>
-        <w:t>y queremos volver a versiones anteriores,</w:t>
+        <w:t>Si algo sale mal en git</w:t>
       </w:r>
       <w:r>
         <w:rPr>
@@ -3390,6 +3701,24 @@
           <w:sz w:val="24"/>
           <w:szCs w:val="24"/>
         </w:rPr>
+        <w:t>y queremos volver a versiones anteriores,</w:t>
+      </w:r>
+      <w:r>
+        <w:rPr>
+          <w:rFonts w:ascii="Arial" w:hAnsi="Arial" w:cs="Arial"/>
+          <w:b/>
+          <w:bCs/>
+          <w:sz w:val="24"/>
+          <w:szCs w:val="24"/>
+        </w:rPr>
+        <w:t xml:space="preserve"> </w:t>
+      </w:r>
+      <w:r>
+        <w:rPr>
+          <w:rFonts w:ascii="Arial" w:hAnsi="Arial" w:cs="Arial"/>
+          <w:sz w:val="24"/>
+          <w:szCs w:val="24"/>
+        </w:rPr>
         <w:t>es decir "todo salió mal y quiero volver completamente a un punto anterior como si nada hubiera pasado", el comando es:</w:t>
       </w:r>
     </w:p>
@@ -3407,6 +3736,7 @@
           <w:sz w:val="24"/>
           <w:szCs w:val="24"/>
         </w:rPr>
+        <w:lastRenderedPageBreak/>
         <w:t xml:space="preserve">git </w:t>
       </w:r>
       <w:proofErr w:type="spellStart"/>
@@ -5321,6 +5651,29 @@
     <w:uiPriority w:val="99"/>
     <w:rsid w:val="00E559AF"/>
   </w:style>
+  <w:style w:type="character" w:styleId="Hipervnculo">
+    <w:name w:val="Hyperlink"/>
+    <w:basedOn w:val="Fuentedeprrafopredeter"/>
+    <w:uiPriority w:val="99"/>
+    <w:unhideWhenUsed/>
+    <w:rsid w:val="00CD1C4F"/>
+    <w:rPr>
+      <w:color w:val="0563C1" w:themeColor="hyperlink"/>
+      <w:u w:val="single"/>
+    </w:rPr>
+  </w:style>
+  <w:style w:type="character" w:styleId="Mencinsinresolver">
+    <w:name w:val="Unresolved Mention"/>
+    <w:basedOn w:val="Fuentedeprrafopredeter"/>
+    <w:uiPriority w:val="99"/>
+    <w:semiHidden/>
+    <w:unhideWhenUsed/>
+    <w:rsid w:val="00CD1C4F"/>
+    <w:rPr>
+      <w:color w:val="605E5C"/>
+      <w:shd w:val="clear" w:color="auto" w:fill="E1DFDD"/>
+    </w:rPr>
+  </w:style>
 </w:styles>
 </file>
 

</xml_diff>